<commit_message>
Anomalies MQTT/LoRa 5 à 7 corrigées ; mqtt.docx mis à jour
Capteur :
- SLEEPS / SLEEPM / SLEEPL acceptés sans le préfixe SLEEP
- <nomBatterie> MESURE traitée sur home/thermometre/command (MQTT et LoRa)
  et sur le topic de commande propre à la batterie (abonnement ajouté)

Relais-Lora :
- STATUS ajoute l'état de la file d'attente (dernière trame, commande en
  attente) pour chaque capteur LoRa

Doc : mqtt.docx régénéré (gen_mqtt_doc.py) : file d'attente du relais,
GET / SET / CONFIG, accusé et STATUS en LoRa, jetons DATE TIME, anomalies
du 26/10 corrigées, topic du relais confrelaislora.

Co-Authored-By: Claude Opus 5.5 <noreply@anthropic.com>
</commit_message>
<xml_diff>
--- a/Doc/mqtt.docx
+++ b/Doc/mqtt.docx
@@ -26,7 +26,7 @@
     </w:p>
     <w:p>
       <w:r>
-        <w:t>Mise à jour du 26/10/2026, établie par lecture des sources : Capteur/src, Relais-Lora/src, Home-Assist/src, CydMonitor/src, Home-Assist-App 1.2/lib, Doc/configuration.yaml et Doc/automations.yaml.</w:t>
+        <w:t>Mise à jour du 27/10/2026, établie par lecture des sources : Capteur/src, Relais-Lora/src, Home-Assist/src, CydMonitor/src, Home-Assist-App 1.2/lib, Doc/configuration.yaml et Doc/automations.yaml.</w:t>
       </w:r>
     </w:p>
     <w:tbl>
@@ -262,7 +262,20 @@
               <w:rPr>
                 <w:sz w:val="20"/>
               </w:rPr>
-              <w:t>• En LoRa, le retain ne suffit pas aujourd'hui : le Relais-Lora reçoit le message retenu à sa propre (re)connexion et le réémet aussitôt par radio ; si le capteur dort, il est perdu. Évolution prévue : le relais mémorise la dernière commande par capteur et la réémet juste après avoir reçu une trame de ce capteur.</w:t>
+              <w:t xml:space="preserve">• Capteur LoRa : </w:t>
+            </w:r>
+            <w:r>
+              <w:rPr>
+                <w:b/>
+                <w:sz w:val="20"/>
+              </w:rPr>
+              <w:t>pas de retain</w:t>
+            </w:r>
+            <w:r>
+              <w:rPr>
+                <w:sz w:val="20"/>
+              </w:rPr>
+              <w:t>. Le Relais-Lora met la commande en file d'attente et la transmet lui-même au réveil suivant du capteur, jusqu'à l'accusé (§ 2.5). Une commande retenue serait remise en file à chaque reconnexion du relais, donc rejouée.</w:t>
             </w:r>
           </w:p>
           <w:p>
@@ -525,13 +538,13 @@
                 <w:rFonts w:ascii="Consolas" w:hAnsi="Consolas" w:eastAsia="Consolas"/>
                 <w:sz w:val="18"/>
               </w:rPr>
-              <w:t>confrelaislora2/</w:t>
-            </w:r>
-            <w:r>
-              <w:rPr>
-                <w:sz w:val="18"/>
-              </w:rPr>
-              <w:t xml:space="preserve"> (relais)</w:t>
+              <w:t>confrelaislora/</w:t>
+            </w:r>
+            <w:r>
+              <w:rPr>
+                <w:sz w:val="18"/>
+              </w:rPr>
+              <w:t xml:space="preserve"> (relais, relevé sur le broker)</w:t>
             </w:r>
           </w:p>
         </w:tc>
@@ -688,7 +701,7 @@
         <w:pStyle w:val="Listepuces"/>
       </w:pPr>
       <w:r>
-        <w:t xml:space="preserve">Date / heure : </w:t>
+        <w:t xml:space="preserve">Date / heure : l'heure d'un capteur n'est jugée valide qu'après une synchronisation NTP (conservée pendant un deep sleep, oubliée à tout autre redémarrage). Sans elle (LoRa seul), le capteur envoie les jetons </w:t>
       </w:r>
       <w:r>
         <w:rPr>
@@ -708,17 +721,7 @@
         <w:t>TIME</w:t>
       </w:r>
       <w:r>
-        <w:t xml:space="preserve"> sont des jetons que le Relais-Lora remplace par sa propre date / heure. Un capteur LoRa sans heure valide envoie actuellement </w:t>
-      </w:r>
-      <w:r>
-        <w:rPr>
-          <w:rFonts w:ascii="Consolas" w:hAnsi="Consolas" w:eastAsia="Consolas"/>
-          <w:sz w:val="18"/>
-        </w:rPr>
-        <w:t>Erreur Erreur</w:t>
-      </w:r>
-      <w:r>
-        <w:t xml:space="preserve"> (non substitué) — voir § 9.</w:t>
+        <w:t>, que le Relais-Lora remplace par sa propre date / heure (heure d'été / hiver automatique).</w:t>
       </w:r>
     </w:p>
     <w:p>
@@ -1270,7 +1273,7 @@
                 <w:rFonts w:ascii="Consolas" w:hAnsi="Consolas" w:eastAsia="Consolas"/>
                 <w:sz w:val="18"/>
               </w:rPr>
-              <w:t>==========home/thermometre/state ThRemise DEEPSLEEP ON DATE HEURE &lt;s&gt; Durée éveil : &lt;ms&gt; ms==========</w:t>
+              <w:t>==========home/thermometre/state ThRemise DEEPSLEEP ON DATE TIME &lt;s&gt; Durée éveil : &lt;ms&gt; ms==========</w:t>
             </w:r>
           </w:p>
         </w:tc>
@@ -1301,7 +1304,7 @@
                 <w:rFonts w:ascii="Consolas" w:hAnsi="Consolas" w:eastAsia="Consolas"/>
                 <w:sz w:val="18"/>
               </w:rPr>
-              <w:t>==========home/confthremise/state === ÉTAT &lt;nom&gt; ===\n&lt;date&gt; &lt;heure&gt;\n[IP : …\n]Wdog : …\nUptime : &lt;s&gt;s==========</w:t>
+              <w:t>==========home/confthremise/state ThRemise COMMANDE reçue à &lt;ms&gt; ms : &lt;commande&gt; (deep sleep : ACTIF|INACTIF)==========</w:t>
             </w:r>
           </w:p>
         </w:tc>
@@ -1315,7 +1318,69 @@
               <w:rPr>
                 <w:sz w:val="18"/>
               </w:rPr>
-              <w:t>Réponse à STATUS</w:t>
+              <w:t>Accusé de toute commande de configuration non vide</w:t>
+            </w:r>
+          </w:p>
+        </w:tc>
+      </w:tr>
+      <w:tr>
+        <w:tc>
+          <w:tcPr>
+            <w:tcW w:type="dxa" w:w="4320"/>
+          </w:tcPr>
+          <w:p>
+            <w:r/>
+            <w:r>
+              <w:rPr>
+                <w:rFonts w:ascii="Consolas" w:hAnsi="Consolas" w:eastAsia="Consolas"/>
+                <w:sz w:val="18"/>
+              </w:rPr>
+              <w:t>==========home/confthremise/state ThRemise ETAT DATE TIME | [IP : &lt;ip&gt; | ]Wdog : … | Uptime : &lt;s&gt;s==========</w:t>
+            </w:r>
+          </w:p>
+        </w:tc>
+        <w:tc>
+          <w:tcPr>
+            <w:tcW w:type="dxa" w:w="4320"/>
+          </w:tcPr>
+          <w:p>
+            <w:r/>
+            <w:r>
+              <w:rPr>
+                <w:sz w:val="18"/>
+              </w:rPr>
+              <w:t>Réponse à STATUS (une ligne, sans « = »)</w:t>
+            </w:r>
+          </w:p>
+        </w:tc>
+      </w:tr>
+      <w:tr>
+        <w:tc>
+          <w:tcPr>
+            <w:tcW w:type="dxa" w:w="4320"/>
+          </w:tcPr>
+          <w:p>
+            <w:r/>
+            <w:r>
+              <w:rPr>
+                <w:rFonts w:ascii="Consolas" w:hAnsi="Consolas" w:eastAsia="Consolas"/>
+                <w:sz w:val="18"/>
+              </w:rPr>
+              <w:t>==========home/confthremise/state ThRemise CONFIG sleepA:1 sleepI:30 … [ERREUR &lt;cle:valeur&gt; …]==========</w:t>
+            </w:r>
+          </w:p>
+        </w:tc>
+        <w:tc>
+          <w:tcPr>
+            <w:tcW w:type="dxa" w:w="4320"/>
+          </w:tcPr>
+          <w:p>
+            <w:r/>
+            <w:r>
+              <w:rPr>
+                <w:sz w:val="18"/>
+              </w:rPr>
+              <w:t>Réponse à GET / SET</w:t>
             </w:r>
           </w:p>
         </w:tc>
@@ -1325,6 +1390,11 @@
       <w:pPr>
         <w:spacing w:after="0"/>
       </w:pPr>
+    </w:p>
+    <w:p>
+      <w:r>
+        <w:t>Une seule série de mesures par réveil (plus de doublons depuis le 27/10/2026).</w:t>
+      </w:r>
     </w:p>
     <w:p>
       <w:pPr>
@@ -1417,7 +1487,20 @@
               <w:rPr>
                 <w:sz w:val="18"/>
               </w:rPr>
-              <w:t xml:space="preserve"> commençant par THREMISE, BATREMISE, FLOTTEURREMISE, THNOMADE, BATNOMADE, FLOTTEURNOMADE, THCAVE ou BATCAVE</w:t>
+              <w:t xml:space="preserve"> commençant par THREMISE, BATREMISE, FLOTTEURREMISE, THNOMADE, BATNOMADE, FLOTTEURNOMADE, THCAVE ou BATCAVE : réémis </w:t>
+            </w:r>
+            <w:r>
+              <w:rPr>
+                <w:b/>
+                <w:sz w:val="18"/>
+              </w:rPr>
+              <w:t>aussitôt</w:t>
+            </w:r>
+            <w:r>
+              <w:rPr>
+                <w:sz w:val="18"/>
+              </w:rPr>
+              <w:t>, sans file d'attente (arrive seulement si le capteur est éveillé)</w:t>
             </w:r>
           </w:p>
         </w:tc>
@@ -1436,6 +1519,12 @@
               </w:rPr>
               <w:t>==========home/confthremise/command &lt;payload&gt;==========</w:t>
             </w:r>
+            <w:r>
+              <w:rPr>
+                <w:sz w:val="18"/>
+              </w:rPr>
+              <w:t xml:space="preserve"> (idem confthnomade)</w:t>
+            </w:r>
           </w:p>
         </w:tc>
         <w:tc>
@@ -1448,14 +1537,20 @@
               <w:rPr>
                 <w:sz w:val="18"/>
               </w:rPr>
-              <w:t xml:space="preserve">Tout payload reçu sur </w:t>
-            </w:r>
-            <w:r>
-              <w:rPr>
-                <w:rFonts w:ascii="Consolas" w:hAnsi="Consolas" w:eastAsia="Consolas"/>
-                <w:sz w:val="18"/>
-              </w:rPr>
-              <w:t>home/confthremise/command</w:t>
+              <w:t xml:space="preserve">Payload non vide reçu sur le topic de configuration d'un capteur LoRa : transmis par la </w:t>
+            </w:r>
+            <w:r>
+              <w:rPr>
+                <w:b/>
+                <w:sz w:val="18"/>
+              </w:rPr>
+              <w:t>file d'attente</w:t>
+            </w:r>
+            <w:r>
+              <w:rPr>
+                <w:sz w:val="18"/>
+              </w:rPr>
+              <w:t xml:space="preserve"> (§ 2.5)</w:t>
             </w:r>
           </w:p>
         </w:tc>
@@ -1469,6 +1564,194 @@
     <w:p>
       <w:r>
         <w:t>Les commandes que le capteur traite à réception sont celles du § 3.2, identiques en MQTT et en LoRa (sauf mention contraire).</w:t>
+      </w:r>
+    </w:p>
+    <w:p>
+      <w:pPr>
+        <w:pStyle w:val="Titre2"/>
+      </w:pPr>
+      <w:r>
+        <w:t>2.5 File d'attente des commandes de configuration (Relais-Lora)</w:t>
+      </w:r>
+    </w:p>
+    <w:p>
+      <w:r>
+        <w:t xml:space="preserve">Un capteur LoRa dort presque tout le temps : le relais garde la </w:t>
+      </w:r>
+      <w:r>
+        <w:rPr>
+          <w:b/>
+        </w:rPr>
+        <w:t>dernière</w:t>
+      </w:r>
+      <w:r>
+        <w:t xml:space="preserve"> commande de configuration de chaque capteur et la lui envoie quand il se manifeste.</w:t>
+      </w:r>
+    </w:p>
+    <w:p>
+      <w:pPr>
+        <w:pStyle w:val="Listepuces"/>
+      </w:pPr>
+      <w:r>
+        <w:t>Table des capteurs dans Relais-Lora/src/global.h (</w:t>
+      </w:r>
+      <w:r>
+        <w:rPr>
+          <w:rFonts w:ascii="Consolas" w:hAnsi="Consolas" w:eastAsia="Consolas"/>
+          <w:sz w:val="18"/>
+        </w:rPr>
+        <w:t>FILE_CMD_CAPTEURS</w:t>
+      </w:r>
+      <w:r>
+        <w:t xml:space="preserve">) : </w:t>
+      </w:r>
+      <w:r>
+        <w:rPr>
+          <w:rFonts w:ascii="Consolas" w:hAnsi="Consolas" w:eastAsia="Consolas"/>
+          <w:sz w:val="18"/>
+        </w:rPr>
+        <w:t>home/confthremise/command</w:t>
+      </w:r>
+      <w:r>
+        <w:t xml:space="preserve"> ↔ noms finissant par </w:t>
+      </w:r>
+      <w:r>
+        <w:rPr>
+          <w:rFonts w:ascii="Consolas" w:hAnsi="Consolas" w:eastAsia="Consolas"/>
+          <w:sz w:val="18"/>
+        </w:rPr>
+        <w:t>Remise</w:t>
+      </w:r>
+      <w:r>
+        <w:t xml:space="preserve"> (ThRemise, BatRemise, FlotteurRemise), </w:t>
+      </w:r>
+      <w:r>
+        <w:rPr>
+          <w:rFonts w:ascii="Consolas" w:hAnsi="Consolas" w:eastAsia="Consolas"/>
+          <w:sz w:val="18"/>
+        </w:rPr>
+        <w:t>home/confthnomade/command</w:t>
+      </w:r>
+      <w:r>
+        <w:t xml:space="preserve"> ↔ </w:t>
+      </w:r>
+      <w:r>
+        <w:rPr>
+          <w:rFonts w:ascii="Consolas" w:hAnsi="Consolas" w:eastAsia="Consolas"/>
+          <w:sz w:val="18"/>
+        </w:rPr>
+        <w:t>Nomade</w:t>
+      </w:r>
+      <w:r>
+        <w:t>. Les abonnements en découlent.</w:t>
+      </w:r>
+    </w:p>
+    <w:p>
+      <w:pPr>
+        <w:pStyle w:val="Listepuces"/>
+      </w:pPr>
+      <w:r>
+        <w:t>Une nouvelle commande remplace la précédente. Un payload vide (effacement d'un retained) est ignoré.</w:t>
+      </w:r>
+    </w:p>
+    <w:p>
+      <w:pPr>
+        <w:pStyle w:val="Listepuces"/>
+      </w:pPr>
+      <w:r>
+        <w:t xml:space="preserve">Envoi : </w:t>
+      </w:r>
+      <w:r>
+        <w:rPr>
+          <w:b/>
+        </w:rPr>
+        <w:t>300 ms après la dernière trame</w:t>
+      </w:r>
+      <w:r>
+        <w:t xml:space="preserve"> reçue du capteur (fin de sa rafale de mesures, pendant sa seconde d'écoute) ; jamais après sa trame </w:t>
+      </w:r>
+      <w:r>
+        <w:rPr>
+          <w:rFonts w:ascii="Consolas" w:hAnsi="Consolas" w:eastAsia="Consolas"/>
+          <w:sz w:val="18"/>
+        </w:rPr>
+        <w:t>DEEPSLEEP ON</w:t>
+      </w:r>
+      <w:r>
+        <w:t>. Une trame après 5 s de silence marque un nouveau réveil.</w:t>
+      </w:r>
+    </w:p>
+    <w:p>
+      <w:pPr>
+        <w:pStyle w:val="Listepuces"/>
+      </w:pPr>
+      <w:r>
+        <w:t xml:space="preserve">Retrait : à réception de l'accusé </w:t>
+      </w:r>
+      <w:r>
+        <w:rPr>
+          <w:rFonts w:ascii="Consolas" w:hAnsi="Consolas" w:eastAsia="Consolas"/>
+          <w:sz w:val="18"/>
+        </w:rPr>
+        <w:t>&lt;nom&gt; COMMANDE reçue … : &lt;commande&gt; …</w:t>
+      </w:r>
+      <w:r>
+        <w:t xml:space="preserve"> sur </w:t>
+      </w:r>
+      <w:r>
+        <w:rPr>
+          <w:rFonts w:ascii="Consolas" w:hAnsi="Consolas" w:eastAsia="Consolas"/>
+          <w:sz w:val="18"/>
+        </w:rPr>
+        <w:t>home/&lt;conf&gt;/state</w:t>
+      </w:r>
+      <w:r>
+        <w:t>.</w:t>
+      </w:r>
+    </w:p>
+    <w:p>
+      <w:pPr>
+        <w:pStyle w:val="Listepuces"/>
+      </w:pPr>
+      <w:r>
+        <w:t xml:space="preserve">Abandon après </w:t>
+      </w:r>
+      <w:r>
+        <w:rPr>
+          <w:b/>
+        </w:rPr>
+        <w:t>10 réveils</w:t>
+      </w:r>
+      <w:r>
+        <w:t xml:space="preserve"> sans accusé, signalé sur </w:t>
+      </w:r>
+      <w:r>
+        <w:rPr>
+          <w:rFonts w:ascii="Consolas" w:hAnsi="Consolas" w:eastAsia="Consolas"/>
+          <w:sz w:val="18"/>
+        </w:rPr>
+        <w:t>home/confrelaislora/state</w:t>
+      </w:r>
+      <w:r>
+        <w:t xml:space="preserve"> : </w:t>
+      </w:r>
+      <w:r>
+        <w:rPr>
+          <w:rFonts w:ascii="Consolas" w:hAnsi="Consolas" w:eastAsia="Consolas"/>
+          <w:sz w:val="18"/>
+        </w:rPr>
+        <w:t>ABANDON commande &lt;topic&gt; : &lt;commande&gt; (10 réveils sans accusé)</w:t>
+      </w:r>
+      <w:r>
+        <w:t>.</w:t>
+      </w:r>
+    </w:p>
+    <w:p>
+      <w:pPr>
+        <w:pStyle w:val="Listepuces"/>
+      </w:pPr>
+      <w:r>
+        <w:t>Délai d'application : jusqu'au réveil suivant du capteur (30 s à 10 min selon l'intervalle de sommeil).</w:t>
       </w:r>
     </w:p>
     <w:p>
@@ -2250,7 +2533,7 @@
               <w:rPr>
                 <w:sz w:val="18"/>
               </w:rPr>
-              <w:t>Accusé de toute commande de configuration non vide (MQTT seulement)</w:t>
+              <w:t>Accusé de toute commande de configuration non vide (MQTT et LoRa)</w:t>
             </w:r>
           </w:p>
         </w:tc>
@@ -2294,7 +2577,20 @@
               <w:rPr>
                 <w:sz w:val="18"/>
               </w:rPr>
-              <w:t xml:space="preserve"> (date, IP, Wdog, Uptime)</w:t>
+              <w:t xml:space="preserve"> (date, IP, Wdog, Uptime) ; en LoRa : une ligne </w:t>
+            </w:r>
+            <w:r>
+              <w:rPr>
+                <w:rFonts w:ascii="Consolas" w:hAnsi="Consolas" w:eastAsia="Consolas"/>
+                <w:sz w:val="18"/>
+              </w:rPr>
+              <w:t>&lt;nom&gt; ETAT …</w:t>
+            </w:r>
+            <w:r>
+              <w:rPr>
+                <w:sz w:val="18"/>
+              </w:rPr>
+              <w:t xml:space="preserve"> (§ 2.3)</w:t>
             </w:r>
           </w:p>
         </w:tc>
@@ -2309,6 +2605,52 @@
                 <w:sz w:val="18"/>
               </w:rPr>
               <w:t>Réponse à STATUS</w:t>
+            </w:r>
+          </w:p>
+        </w:tc>
+      </w:tr>
+      <w:tr>
+        <w:tc>
+          <w:tcPr>
+            <w:tcW w:type="dxa" w:w="2880"/>
+          </w:tcPr>
+          <w:p>
+            <w:r/>
+            <w:r>
+              <w:rPr>
+                <w:rFonts w:ascii="Consolas" w:hAnsi="Consolas" w:eastAsia="Consolas"/>
+                <w:sz w:val="18"/>
+              </w:rPr>
+              <w:t>home/&lt;conf&gt;/state</w:t>
+            </w:r>
+          </w:p>
+        </w:tc>
+        <w:tc>
+          <w:tcPr>
+            <w:tcW w:type="dxa" w:w="2880"/>
+          </w:tcPr>
+          <w:p>
+            <w:r/>
+            <w:r>
+              <w:rPr>
+                <w:rFonts w:ascii="Consolas" w:hAnsi="Consolas" w:eastAsia="Consolas"/>
+                <w:sz w:val="18"/>
+              </w:rPr>
+              <w:t>&lt;nomConfig&gt; CONFIG sleepA:&lt;0|1&gt; sleepI:&lt;s&gt; sleepS:&lt;s&gt; sleepM:&lt;s&gt; sleepL:&lt;s&gt; wakeI:&lt;s&gt; [ERREUR &lt;cle:valeur&gt; …]</w:t>
+            </w:r>
+          </w:p>
+        </w:tc>
+        <w:tc>
+          <w:tcPr>
+            <w:tcW w:type="dxa" w:w="2880"/>
+          </w:tcPr>
+          <w:p>
+            <w:r/>
+            <w:r>
+              <w:rPr>
+                <w:sz w:val="18"/>
+              </w:rPr>
+              <w:t>Réponse à GET et à SET (MQTT et LoRa)</w:t>
             </w:r>
           </w:p>
         </w:tc>
@@ -2707,33 +3049,52 @@
                 <w:rFonts w:ascii="Consolas" w:hAnsi="Consolas" w:eastAsia="Consolas"/>
                 <w:sz w:val="18"/>
               </w:rPr>
+              <w:t>SLEEPS</w:t>
+            </w:r>
+            <w:r>
+              <w:rPr>
+                <w:sz w:val="18"/>
+              </w:rPr>
+              <w:t xml:space="preserve"> / </w:t>
+            </w:r>
+            <w:r>
+              <w:rPr>
+                <w:rFonts w:ascii="Consolas" w:hAnsi="Consolas" w:eastAsia="Consolas"/>
+                <w:sz w:val="18"/>
+              </w:rPr>
+              <w:t>SLEEPM</w:t>
+            </w:r>
+            <w:r>
+              <w:rPr>
+                <w:sz w:val="18"/>
+              </w:rPr>
+              <w:t xml:space="preserve"> / </w:t>
+            </w:r>
+            <w:r>
+              <w:rPr>
+                <w:rFonts w:ascii="Consolas" w:hAnsi="Consolas" w:eastAsia="Consolas"/>
+                <w:sz w:val="18"/>
+              </w:rPr>
+              <w:t>SLEEPL</w:t>
+            </w:r>
+            <w:r>
+              <w:rPr>
+                <w:sz w:val="18"/>
+              </w:rPr>
+              <w:t xml:space="preserve"> (ou </w:t>
+            </w:r>
+            <w:r>
+              <w:rPr>
+                <w:rFonts w:ascii="Consolas" w:hAnsi="Consolas" w:eastAsia="Consolas"/>
+                <w:sz w:val="18"/>
+              </w:rPr>
               <w:t>SLEEP SLEEPS</w:t>
             </w:r>
             <w:r>
               <w:rPr>
                 <w:sz w:val="18"/>
               </w:rPr>
-              <w:t xml:space="preserve"> / </w:t>
-            </w:r>
-            <w:r>
-              <w:rPr>
-                <w:rFonts w:ascii="Consolas" w:hAnsi="Consolas" w:eastAsia="Consolas"/>
-                <w:sz w:val="18"/>
-              </w:rPr>
-              <w:t>SLEEP SLEEPM</w:t>
-            </w:r>
-            <w:r>
-              <w:rPr>
-                <w:sz w:val="18"/>
-              </w:rPr>
-              <w:t xml:space="preserve"> / </w:t>
-            </w:r>
-            <w:r>
-              <w:rPr>
-                <w:rFonts w:ascii="Consolas" w:hAnsi="Consolas" w:eastAsia="Consolas"/>
-                <w:sz w:val="18"/>
-              </w:rPr>
-              <w:t>SLEEP SLEEPL</w:t>
+              <w:t xml:space="preserve"> …)</w:t>
             </w:r>
           </w:p>
         </w:tc>
@@ -2786,6 +3147,19 @@
                 <w:rFonts w:ascii="Consolas" w:hAnsi="Consolas" w:eastAsia="Consolas"/>
                 <w:sz w:val="18"/>
               </w:rPr>
+              <w:t>SLEEPS &lt;n&gt;</w:t>
+            </w:r>
+            <w:r>
+              <w:rPr>
+                <w:sz w:val="18"/>
+              </w:rPr>
+              <w:t xml:space="preserve"> ou </w:t>
+            </w:r>
+            <w:r>
+              <w:rPr>
+                <w:rFonts w:ascii="Consolas" w:hAnsi="Consolas" w:eastAsia="Consolas"/>
+                <w:sz w:val="18"/>
+              </w:rPr>
               <w:t>SLEEP SLEEPS &lt;n&gt;</w:t>
             </w:r>
             <w:r>
@@ -2845,20 +3219,7 @@
                 <w:rFonts w:ascii="Consolas" w:hAnsi="Consolas" w:eastAsia="Consolas"/>
                 <w:sz w:val="18"/>
               </w:rPr>
-              <w:t>WDOG ENABLE</w:t>
-            </w:r>
-            <w:r>
-              <w:rPr>
-                <w:sz w:val="18"/>
-              </w:rPr>
-              <w:t xml:space="preserve"> / </w:t>
-            </w:r>
-            <w:r>
-              <w:rPr>
-                <w:rFonts w:ascii="Consolas" w:hAnsi="Consolas" w:eastAsia="Consolas"/>
-                <w:sz w:val="18"/>
-              </w:rPr>
-              <w:t>WDOG DISABLE</w:t>
+              <w:t>GET</w:t>
             </w:r>
           </w:p>
         </w:tc>
@@ -2872,7 +3233,20 @@
               <w:rPr>
                 <w:sz w:val="18"/>
               </w:rPr>
-              <w:t>Active / désactive le watchdog ALIVE</w:t>
+              <w:t xml:space="preserve">Publie la configuration modifiable à distance (réponse </w:t>
+            </w:r>
+            <w:r>
+              <w:rPr>
+                <w:rFonts w:ascii="Consolas" w:hAnsi="Consolas" w:eastAsia="Consolas"/>
+                <w:sz w:val="18"/>
+              </w:rPr>
+              <w:t>CONFIG</w:t>
+            </w:r>
+            <w:r>
+              <w:rPr>
+                <w:sz w:val="18"/>
+              </w:rPr>
+              <w:t>, § 3.1)</w:t>
             </w:r>
           </w:p>
         </w:tc>
@@ -2911,7 +3285,20 @@
                 <w:rFonts w:ascii="Consolas" w:hAnsi="Consolas" w:eastAsia="Consolas"/>
                 <w:sz w:val="18"/>
               </w:rPr>
-              <w:t>WDOG &lt;s&gt;</w:t>
+              <w:t>SET &lt;cle&gt; &lt;valeur&gt; […]</w:t>
+            </w:r>
+            <w:r>
+              <w:rPr>
+                <w:sz w:val="18"/>
+              </w:rPr>
+              <w:t xml:space="preserve"> ou </w:t>
+            </w:r>
+            <w:r>
+              <w:rPr>
+                <w:rFonts w:ascii="Consolas" w:hAnsi="Consolas" w:eastAsia="Consolas"/>
+                <w:sz w:val="18"/>
+              </w:rPr>
+              <w:t>SET &lt;cle&gt;:&lt;valeur&gt; […]</w:t>
             </w:r>
           </w:p>
         </w:tc>
@@ -2925,7 +3312,111 @@
               <w:rPr>
                 <w:sz w:val="18"/>
               </w:rPr>
-              <w:t>Période ALIVE = s secondes (&gt; 0), et active le watchdog</w:t>
+              <w:t xml:space="preserve">Modifie un ou plusieurs paramètres, enregistre en NVS, répond </w:t>
+            </w:r>
+            <w:r>
+              <w:rPr>
+                <w:rFonts w:ascii="Consolas" w:hAnsi="Consolas" w:eastAsia="Consolas"/>
+                <w:sz w:val="18"/>
+              </w:rPr>
+              <w:t>CONFIG</w:t>
+            </w:r>
+            <w:r>
+              <w:rPr>
+                <w:sz w:val="18"/>
+              </w:rPr>
+              <w:t xml:space="preserve"> (paramètres refusés listés après </w:t>
+            </w:r>
+            <w:r>
+              <w:rPr>
+                <w:rFonts w:ascii="Consolas" w:hAnsi="Consolas" w:eastAsia="Consolas"/>
+                <w:sz w:val="18"/>
+              </w:rPr>
+              <w:t>ERREUR</w:t>
+            </w:r>
+            <w:r>
+              <w:rPr>
+                <w:sz w:val="18"/>
+              </w:rPr>
+              <w:t xml:space="preserve">). Clés (noms NVS, casse indifférente) : </w:t>
+            </w:r>
+            <w:r>
+              <w:rPr>
+                <w:rFonts w:ascii="Consolas" w:hAnsi="Consolas" w:eastAsia="Consolas"/>
+                <w:sz w:val="18"/>
+              </w:rPr>
+              <w:t>sleepA</w:t>
+            </w:r>
+            <w:r>
+              <w:rPr>
+                <w:sz w:val="18"/>
+              </w:rPr>
+              <w:t xml:space="preserve"> 0/1, </w:t>
+            </w:r>
+            <w:r>
+              <w:rPr>
+                <w:rFonts w:ascii="Consolas" w:hAnsi="Consolas" w:eastAsia="Consolas"/>
+                <w:sz w:val="18"/>
+              </w:rPr>
+              <w:t>sleepI</w:t>
+            </w:r>
+            <w:r>
+              <w:rPr>
+                <w:sz w:val="18"/>
+              </w:rPr>
+              <w:t xml:space="preserve">, </w:t>
+            </w:r>
+            <w:r>
+              <w:rPr>
+                <w:rFonts w:ascii="Consolas" w:hAnsi="Consolas" w:eastAsia="Consolas"/>
+                <w:sz w:val="18"/>
+              </w:rPr>
+              <w:t>sleepS</w:t>
+            </w:r>
+            <w:r>
+              <w:rPr>
+                <w:sz w:val="18"/>
+              </w:rPr>
+              <w:t xml:space="preserve">, </w:t>
+            </w:r>
+            <w:r>
+              <w:rPr>
+                <w:rFonts w:ascii="Consolas" w:hAnsi="Consolas" w:eastAsia="Consolas"/>
+                <w:sz w:val="18"/>
+              </w:rPr>
+              <w:t>sleepM</w:t>
+            </w:r>
+            <w:r>
+              <w:rPr>
+                <w:sz w:val="18"/>
+              </w:rPr>
+              <w:t xml:space="preserve">, </w:t>
+            </w:r>
+            <w:r>
+              <w:rPr>
+                <w:rFonts w:ascii="Consolas" w:hAnsi="Consolas" w:eastAsia="Consolas"/>
+                <w:sz w:val="18"/>
+              </w:rPr>
+              <w:t>sleepL</w:t>
+            </w:r>
+            <w:r>
+              <w:rPr>
+                <w:sz w:val="18"/>
+              </w:rPr>
+              <w:t xml:space="preserve"> (1 à 86 400 s), </w:t>
+            </w:r>
+            <w:r>
+              <w:rPr>
+                <w:rFonts w:ascii="Consolas" w:hAnsi="Consolas" w:eastAsia="Consolas"/>
+                <w:sz w:val="18"/>
+              </w:rPr>
+              <w:t>wakeI</w:t>
+            </w:r>
+            <w:r>
+              <w:rPr>
+                <w:sz w:val="18"/>
+              </w:rPr>
+              <w:t xml:space="preserve"> (1 à 3 600 s)</w:t>
             </w:r>
           </w:p>
         </w:tc>
@@ -2964,7 +3455,20 @@
                 <w:rFonts w:ascii="Consolas" w:hAnsi="Consolas" w:eastAsia="Consolas"/>
                 <w:sz w:val="18"/>
               </w:rPr>
-              <w:t>STATUS</w:t>
+              <w:t>WDOG ENABLE</w:t>
+            </w:r>
+            <w:r>
+              <w:rPr>
+                <w:sz w:val="18"/>
+              </w:rPr>
+              <w:t xml:space="preserve"> / </w:t>
+            </w:r>
+            <w:r>
+              <w:rPr>
+                <w:rFonts w:ascii="Consolas" w:hAnsi="Consolas" w:eastAsia="Consolas"/>
+                <w:sz w:val="18"/>
+              </w:rPr>
+              <w:t>WDOG DISABLE</w:t>
             </w:r>
           </w:p>
         </w:tc>
@@ -2978,20 +3482,7 @@
               <w:rPr>
                 <w:sz w:val="18"/>
               </w:rPr>
-              <w:t xml:space="preserve">Publie le rapport d'état sur </w:t>
-            </w:r>
-            <w:r>
-              <w:rPr>
-                <w:rFonts w:ascii="Consolas" w:hAnsi="Consolas" w:eastAsia="Consolas"/>
-                <w:sz w:val="18"/>
-              </w:rPr>
-              <w:t>home/&lt;conf&gt;/state</w:t>
-            </w:r>
-            <w:r>
-              <w:rPr>
-                <w:sz w:val="18"/>
-              </w:rPr>
-              <w:t xml:space="preserve"> (par LoRa si reçu par LoRa)</w:t>
+              <w:t>Active / désactive le watchdog ALIVE</w:t>
             </w:r>
           </w:p>
         </w:tc>
@@ -3030,7 +3521,7 @@
                 <w:rFonts w:ascii="Consolas" w:hAnsi="Consolas" w:eastAsia="Consolas"/>
                 <w:sz w:val="18"/>
               </w:rPr>
-              <w:t>REBOOT</w:t>
+              <w:t>WDOG &lt;s&gt;</w:t>
             </w:r>
           </w:p>
         </w:tc>
@@ -3044,7 +3535,7 @@
               <w:rPr>
                 <w:sz w:val="18"/>
               </w:rPr>
-              <w:t>Redémarre l'ESP32</w:t>
+              <w:t>Période ALIVE = s secondes (&gt; 0), et active le watchdog</w:t>
             </w:r>
           </w:p>
         </w:tc>
@@ -3070,6 +3561,125 @@
           </w:tcPr>
           <w:p>
             <w:r/>
+          </w:p>
+        </w:tc>
+        <w:tc>
+          <w:tcPr>
+            <w:tcW w:type="dxa" w:w="2160"/>
+          </w:tcPr>
+          <w:p>
+            <w:r/>
+            <w:r>
+              <w:rPr>
+                <w:rFonts w:ascii="Consolas" w:hAnsi="Consolas" w:eastAsia="Consolas"/>
+                <w:sz w:val="18"/>
+              </w:rPr>
+              <w:t>STATUS</w:t>
+            </w:r>
+          </w:p>
+        </w:tc>
+        <w:tc>
+          <w:tcPr>
+            <w:tcW w:type="dxa" w:w="2160"/>
+          </w:tcPr>
+          <w:p>
+            <w:r/>
+            <w:r>
+              <w:rPr>
+                <w:sz w:val="18"/>
+              </w:rPr>
+              <w:t xml:space="preserve">Publie le rapport d'état sur </w:t>
+            </w:r>
+            <w:r>
+              <w:rPr>
+                <w:rFonts w:ascii="Consolas" w:hAnsi="Consolas" w:eastAsia="Consolas"/>
+                <w:sz w:val="18"/>
+              </w:rPr>
+              <w:t>home/&lt;conf&gt;/state</w:t>
+            </w:r>
+            <w:r>
+              <w:rPr>
+                <w:sz w:val="18"/>
+              </w:rPr>
+              <w:t xml:space="preserve"> (par LoRa si reçu par LoRa)</w:t>
+            </w:r>
+          </w:p>
+        </w:tc>
+        <w:tc>
+          <w:tcPr>
+            <w:tcW w:type="dxa" w:w="2160"/>
+          </w:tcPr>
+          <w:p>
+            <w:r/>
+            <w:r>
+              <w:rPr>
+                <w:sz w:val="18"/>
+              </w:rPr>
+              <w:t>les deux</w:t>
+            </w:r>
+          </w:p>
+        </w:tc>
+      </w:tr>
+      <w:tr>
+        <w:tc>
+          <w:tcPr>
+            <w:tcW w:type="dxa" w:w="2160"/>
+          </w:tcPr>
+          <w:p>
+            <w:r/>
+          </w:p>
+        </w:tc>
+        <w:tc>
+          <w:tcPr>
+            <w:tcW w:type="dxa" w:w="2160"/>
+          </w:tcPr>
+          <w:p>
+            <w:r/>
+            <w:r>
+              <w:rPr>
+                <w:rFonts w:ascii="Consolas" w:hAnsi="Consolas" w:eastAsia="Consolas"/>
+                <w:sz w:val="18"/>
+              </w:rPr>
+              <w:t>REBOOT</w:t>
+            </w:r>
+          </w:p>
+        </w:tc>
+        <w:tc>
+          <w:tcPr>
+            <w:tcW w:type="dxa" w:w="2160"/>
+          </w:tcPr>
+          <w:p>
+            <w:r/>
+            <w:r>
+              <w:rPr>
+                <w:sz w:val="18"/>
+              </w:rPr>
+              <w:t>Redémarre l'ESP32</w:t>
+            </w:r>
+          </w:p>
+        </w:tc>
+        <w:tc>
+          <w:tcPr>
+            <w:tcW w:type="dxa" w:w="2160"/>
+          </w:tcPr>
+          <w:p>
+            <w:r/>
+            <w:r>
+              <w:rPr>
+                <w:sz w:val="18"/>
+              </w:rPr>
+              <w:t>les deux</w:t>
+            </w:r>
+          </w:p>
+        </w:tc>
+      </w:tr>
+      <w:tr>
+        <w:tc>
+          <w:tcPr>
+            <w:tcW w:type="dxa" w:w="2160"/>
+          </w:tcPr>
+          <w:p>
+            <w:r/>
             <w:r>
               <w:rPr>
                 <w:rFonts w:ascii="Consolas" w:hAnsi="Consolas" w:eastAsia="Consolas"/>
@@ -3104,7 +3714,7 @@
               <w:rPr>
                 <w:sz w:val="18"/>
               </w:rPr>
-              <w:t>Mesure immédiate et publication FORCE (DS18B20, DHT20, TCS34725, flotteur)</w:t>
+              <w:t>Mesure immédiate et publication FORCE (DS18B20, DHT20, TCS34725, flotteur, batterie)</w:t>
             </w:r>
           </w:p>
         </w:tc>
@@ -3119,6 +3729,78 @@
                 <w:sz w:val="18"/>
               </w:rPr>
               <w:t>les deux</w:t>
+            </w:r>
+          </w:p>
+        </w:tc>
+      </w:tr>
+      <w:tr>
+        <w:tc>
+          <w:tcPr>
+            <w:tcW w:type="dxa" w:w="2160"/>
+          </w:tcPr>
+          <w:p>
+            <w:r/>
+            <w:r>
+              <w:rPr>
+                <w:sz w:val="18"/>
+              </w:rPr>
+              <w:t xml:space="preserve">topic de commande de la batterie (ex. </w:t>
+            </w:r>
+            <w:r>
+              <w:rPr>
+                <w:rFonts w:ascii="Consolas" w:hAnsi="Consolas" w:eastAsia="Consolas"/>
+                <w:sz w:val="18"/>
+              </w:rPr>
+              <w:t>home/batt/command</w:t>
+            </w:r>
+            <w:r>
+              <w:rPr>
+                <w:sz w:val="18"/>
+              </w:rPr>
+              <w:t>)</w:t>
+            </w:r>
+          </w:p>
+        </w:tc>
+        <w:tc>
+          <w:tcPr>
+            <w:tcW w:type="dxa" w:w="2160"/>
+          </w:tcPr>
+          <w:p>
+            <w:r/>
+            <w:r>
+              <w:rPr>
+                <w:rFonts w:ascii="Consolas" w:hAnsi="Consolas" w:eastAsia="Consolas"/>
+                <w:sz w:val="18"/>
+              </w:rPr>
+              <w:t>&lt;nomBatterie&gt; MESURE</w:t>
+            </w:r>
+          </w:p>
+        </w:tc>
+        <w:tc>
+          <w:tcPr>
+            <w:tcW w:type="dxa" w:w="2160"/>
+          </w:tcPr>
+          <w:p>
+            <w:r/>
+            <w:r>
+              <w:rPr>
+                <w:sz w:val="18"/>
+              </w:rPr>
+              <w:t>Idem pour la batterie (topic propre, celui du CYD par défaut)</w:t>
+            </w:r>
+          </w:p>
+        </w:tc>
+        <w:tc>
+          <w:tcPr>
+            <w:tcW w:type="dxa" w:w="2160"/>
+          </w:tcPr>
+          <w:p>
+            <w:r/>
+            <w:r>
+              <w:rPr>
+                <w:sz w:val="18"/>
+              </w:rPr>
+              <w:t>MQTT</w:t>
             </w:r>
           </w:p>
         </w:tc>
@@ -3369,27 +4051,17 @@
     </w:p>
     <w:p>
       <w:r>
-        <w:t xml:space="preserve">Attention à la syntaxe : </w:t>
+        <w:t xml:space="preserve">Les durées sont en secondes. En LoRa, les commandes de configuration passent par la file d'attente du relais (§ 2.5) ; celles de </w:t>
       </w:r>
       <w:r>
         <w:rPr>
           <w:rFonts w:ascii="Consolas" w:hAnsi="Consolas" w:eastAsia="Consolas"/>
           <w:sz w:val="18"/>
         </w:rPr>
-        <w:t>SLEEPS</w:t>
+        <w:t>home/thermometre/command</w:t>
       </w:r>
       <w:r>
-        <w:t xml:space="preserve"> seul est refusé, il faut </w:t>
-      </w:r>
-      <w:r>
-        <w:rPr>
-          <w:rFonts w:ascii="Consolas" w:hAnsi="Consolas" w:eastAsia="Consolas"/>
-          <w:sz w:val="18"/>
-        </w:rPr>
-        <w:t>SLEEP SLEEPS</w:t>
-      </w:r>
-      <w:r>
-        <w:t>. Les durées sont en secondes.</w:t>
+        <w:t xml:space="preserve"> (MESURE, ACK) n'arrivent que si le capteur est éveillé.</w:t>
       </w:r>
     </w:p>
     <w:p>
@@ -3481,7 +4153,7 @@
                 <w:rFonts w:ascii="Consolas" w:hAnsi="Consolas" w:eastAsia="Consolas"/>
                 <w:sz w:val="18"/>
               </w:rPr>
-              <w:t>home/confrelaislora2/command</w:t>
+              <w:t>home/confrelaislora/command</w:t>
             </w:r>
           </w:p>
         </w:tc>
@@ -3523,6 +4195,19 @@
               <w:rPr>
                 <w:sz w:val="18"/>
               </w:rPr>
+              <w:t xml:space="preserve"> puis une ligne par capteur LoRa </w:t>
+            </w:r>
+            <w:r>
+              <w:rPr>
+                <w:rFonts w:ascii="Consolas" w:hAnsi="Consolas" w:eastAsia="Consolas"/>
+                <w:sz w:val="18"/>
+              </w:rPr>
+              <w:t>&lt;topic de config&gt; : dernière trame il y a &lt;s&gt; s|jamais vu [— en attente : &lt;commande&gt; (envoi &lt;n&gt;/10)]</w:t>
+            </w:r>
+            <w:r>
+              <w:rPr>
+                <w:sz w:val="18"/>
+              </w:rPr>
               <w:t xml:space="preserve"> sur </w:t>
             </w:r>
             <w:r>
@@ -3530,7 +4215,7 @@
                 <w:rFonts w:ascii="Consolas" w:hAnsi="Consolas" w:eastAsia="Consolas"/>
                 <w:sz w:val="18"/>
               </w:rPr>
-              <w:t>home/confrelaislora2/state</w:t>
+              <w:t>home/confrelaislora/state</w:t>
             </w:r>
           </w:p>
         </w:tc>
@@ -3614,7 +4299,7 @@
               <w:rPr>
                 <w:sz w:val="18"/>
               </w:rPr>
-              <w:t>Réémis par LoRa (§ 2.4) ; autres payloads ignorés</w:t>
+              <w:t>Réémis aussitôt par LoRa (§ 2.4) ; autres payloads ignorés</w:t>
             </w:r>
           </w:p>
         </w:tc>
@@ -3633,33 +4318,46 @@
               </w:rPr>
               <w:t>home/confthremise/command</w:t>
             </w:r>
-          </w:p>
-        </w:tc>
-        <w:tc>
-          <w:tcPr>
-            <w:tcW w:type="dxa" w:w="2880"/>
-          </w:tcPr>
-          <w:p>
-            <w:r/>
-            <w:r>
-              <w:rPr>
-                <w:sz w:val="18"/>
-              </w:rPr>
-              <w:t>Tout payload</w:t>
-            </w:r>
-          </w:p>
-        </w:tc>
-        <w:tc>
-          <w:tcPr>
-            <w:tcW w:type="dxa" w:w="2880"/>
-          </w:tcPr>
-          <w:p>
-            <w:r/>
-            <w:r>
-              <w:rPr>
-                <w:sz w:val="18"/>
-              </w:rPr>
-              <w:t>Réémis par LoRa (§ 2.4)</w:t>
+            <w:r>
+              <w:rPr>
+                <w:sz w:val="18"/>
+              </w:rPr>
+              <w:t xml:space="preserve">, </w:t>
+            </w:r>
+            <w:r>
+              <w:rPr>
+                <w:rFonts w:ascii="Consolas" w:hAnsi="Consolas" w:eastAsia="Consolas"/>
+                <w:sz w:val="18"/>
+              </w:rPr>
+              <w:t>home/confthnomade/command</w:t>
+            </w:r>
+          </w:p>
+        </w:tc>
+        <w:tc>
+          <w:tcPr>
+            <w:tcW w:type="dxa" w:w="2880"/>
+          </w:tcPr>
+          <w:p>
+            <w:r/>
+            <w:r>
+              <w:rPr>
+                <w:sz w:val="18"/>
+              </w:rPr>
+              <w:t>Tout payload non vide</w:t>
+            </w:r>
+          </w:p>
+        </w:tc>
+        <w:tc>
+          <w:tcPr>
+            <w:tcW w:type="dxa" w:w="2880"/>
+          </w:tcPr>
+          <w:p>
+            <w:r/>
+            <w:r>
+              <w:rPr>
+                <w:sz w:val="18"/>
+              </w:rPr>
+              <w:t>Mis en file d'attente, transmis au réveil du capteur (§ 2.5)</w:t>
             </w:r>
           </w:p>
         </w:tc>
@@ -3880,7 +4578,7 @@
                 <w:rFonts w:ascii="Consolas" w:hAnsi="Consolas" w:eastAsia="Consolas"/>
                 <w:sz w:val="18"/>
               </w:rPr>
-              <w:t>home/confrelaislora2/state</w:t>
+              <w:t>home/confrelaislora/state</w:t>
             </w:r>
           </w:p>
         </w:tc>
@@ -3926,7 +4624,7 @@
                 <w:rFonts w:ascii="Consolas" w:hAnsi="Consolas" w:eastAsia="Consolas"/>
                 <w:sz w:val="18"/>
               </w:rPr>
-              <w:t>home/confrelaislora2/state</w:t>
+              <w:t>home/confrelaislora/state</w:t>
             </w:r>
           </w:p>
         </w:tc>
@@ -3985,7 +4683,7 @@
                 <w:rFonts w:ascii="Consolas" w:hAnsi="Consolas" w:eastAsia="Consolas"/>
                 <w:sz w:val="18"/>
               </w:rPr>
-              <w:t>home/confrelaislora2/state</w:t>
+              <w:t>home/confrelaislora/state</w:t>
             </w:r>
           </w:p>
         </w:tc>
@@ -4014,6 +4712,52 @@
                 <w:sz w:val="18"/>
               </w:rPr>
               <w:t>Réponse à STATUS</w:t>
+            </w:r>
+          </w:p>
+        </w:tc>
+      </w:tr>
+      <w:tr>
+        <w:tc>
+          <w:tcPr>
+            <w:tcW w:type="dxa" w:w="2880"/>
+          </w:tcPr>
+          <w:p>
+            <w:r/>
+            <w:r>
+              <w:rPr>
+                <w:rFonts w:ascii="Consolas" w:hAnsi="Consolas" w:eastAsia="Consolas"/>
+                <w:sz w:val="18"/>
+              </w:rPr>
+              <w:t>home/confrelaislora/state</w:t>
+            </w:r>
+          </w:p>
+        </w:tc>
+        <w:tc>
+          <w:tcPr>
+            <w:tcW w:type="dxa" w:w="2880"/>
+          </w:tcPr>
+          <w:p>
+            <w:r/>
+            <w:r>
+              <w:rPr>
+                <w:rFonts w:ascii="Consolas" w:hAnsi="Consolas" w:eastAsia="Consolas"/>
+                <w:sz w:val="18"/>
+              </w:rPr>
+              <w:t>ABANDON commande &lt;topic&gt; : &lt;commande&gt; (10 réveils sans accusé)</w:t>
+            </w:r>
+          </w:p>
+        </w:tc>
+        <w:tc>
+          <w:tcPr>
+            <w:tcW w:type="dxa" w:w="2880"/>
+          </w:tcPr>
+          <w:p>
+            <w:r/>
+            <w:r>
+              <w:rPr>
+                <w:sz w:val="18"/>
+              </w:rPr>
+              <w:t>Abandon d'une commande en file (§ 2.5)</w:t>
             </w:r>
           </w:p>
         </w:tc>
@@ -8155,21 +8899,21 @@
               <w:rPr>
                 <w:sz w:val="18"/>
               </w:rPr>
-              <w:t>HA (SLEEP)</w:t>
-            </w:r>
-          </w:p>
-        </w:tc>
-        <w:tc>
-          <w:tcPr>
-            <w:tcW w:type="dxa" w:w="2880"/>
-          </w:tcPr>
-          <w:p>
-            <w:r/>
-            <w:r>
-              <w:rPr>
-                <w:sz w:val="18"/>
-              </w:rPr>
-              <w:t>ThRemise (Wi-Fi), Relais-Lora (→ LoRa)</w:t>
+              <w:t>HA (SLEEP), utilisateur (GET, SET, STATUS…)</w:t>
+            </w:r>
+          </w:p>
+        </w:tc>
+        <w:tc>
+          <w:tcPr>
+            <w:tcW w:type="dxa" w:w="2880"/>
+          </w:tcPr>
+          <w:p>
+            <w:r/>
+            <w:r>
+              <w:rPr>
+                <w:sz w:val="18"/>
+              </w:rPr>
+              <w:t>ThRemise (Wi-Fi), Relais-Lora (→ file d'attente → LoRa)</w:t>
             </w:r>
           </w:p>
         </w:tc>
@@ -8200,21 +8944,21 @@
               <w:rPr>
                 <w:sz w:val="18"/>
               </w:rPr>
-              <w:t>HA (SLEEP)</w:t>
-            </w:r>
-          </w:p>
-        </w:tc>
-        <w:tc>
-          <w:tcPr>
-            <w:tcW w:type="dxa" w:w="2880"/>
-          </w:tcPr>
-          <w:p>
-            <w:r/>
-            <w:r>
-              <w:rPr>
-                <w:sz w:val="18"/>
-              </w:rPr>
-              <w:t>ThNomade (Wi-Fi) — non relayé en LoRa</w:t>
+              <w:t>HA (SLEEP), utilisateur</w:t>
+            </w:r>
+          </w:p>
+        </w:tc>
+        <w:tc>
+          <w:tcPr>
+            <w:tcW w:type="dxa" w:w="2880"/>
+          </w:tcPr>
+          <w:p>
+            <w:r/>
+            <w:r>
+              <w:rPr>
+                <w:sz w:val="18"/>
+              </w:rPr>
+              <w:t>ThNomade (Wi-Fi), Relais-Lora (→ file d'attente → LoRa)</w:t>
             </w:r>
           </w:p>
         </w:tc>
@@ -8245,21 +8989,21 @@
               <w:rPr>
                 <w:sz w:val="18"/>
               </w:rPr>
-              <w:t>Capteurs (accusé, STATUS, LWT)</w:t>
-            </w:r>
-          </w:p>
-        </w:tc>
-        <w:tc>
-          <w:tcPr>
-            <w:tcW w:type="dxa" w:w="2880"/>
-          </w:tcPr>
-          <w:p>
-            <w:r/>
-            <w:r>
-              <w:rPr>
-                <w:sz w:val="18"/>
-              </w:rPr>
-              <w:t>Home Assistant, MQTTBox</w:t>
+              <w:t>Capteurs (accusé, CONFIG, STATUS, LWT), en LoRa via le relais</w:t>
+            </w:r>
+          </w:p>
+        </w:tc>
+        <w:tc>
+          <w:tcPr>
+            <w:tcW w:type="dxa" w:w="2880"/>
+          </w:tcPr>
+          <w:p>
+            <w:r/>
+            <w:r>
+              <w:rPr>
+                <w:sz w:val="18"/>
+              </w:rPr>
+              <w:t>Home Assistant, MQTTBox, Relais-Lora (accusés)</w:t>
             </w:r>
           </w:p>
         </w:tc>
@@ -8276,21 +9020,21 @@
                 <w:rFonts w:ascii="Consolas" w:hAnsi="Consolas" w:eastAsia="Consolas"/>
                 <w:sz w:val="18"/>
               </w:rPr>
-              <w:t>home/confrelaislora2/command|state</w:t>
-            </w:r>
-          </w:p>
-        </w:tc>
-        <w:tc>
-          <w:tcPr>
-            <w:tcW w:type="dxa" w:w="2880"/>
-          </w:tcPr>
-          <w:p>
-            <w:r/>
-            <w:r>
-              <w:rPr>
-                <w:sz w:val="18"/>
-              </w:rPr>
-              <w:t>HA / relais</w:t>
+              <w:t>home/confrelaislora/command|state</w:t>
+            </w:r>
+          </w:p>
+        </w:tc>
+        <w:tc>
+          <w:tcPr>
+            <w:tcW w:type="dxa" w:w="2880"/>
+          </w:tcPr>
+          <w:p>
+            <w:r/>
+            <w:r>
+              <w:rPr>
+                <w:sz w:val="18"/>
+              </w:rPr>
+              <w:t>HA / relais (STATUS, ABANDON)</w:t>
             </w:r>
           </w:p>
         </w:tc>
@@ -8411,6 +9155,144 @@
       </w:pPr>
       <w:r>
         <w:t>8. Ce qui a changé par rapport à la version précédente du document</w:t>
+      </w:r>
+    </w:p>
+    <w:p>
+      <w:r>
+        <w:rPr>
+          <w:b/>
+        </w:rPr>
+        <w:t>Version du 27/10/2026</w:t>
+      </w:r>
+      <w:r>
+        <w:t xml:space="preserve"> (commits 1cc5665, 064c1ed, 306f88b et suivant) :</w:t>
+      </w:r>
+    </w:p>
+    <w:p>
+      <w:pPr>
+        <w:pStyle w:val="Listepuces"/>
+      </w:pPr>
+      <w:r>
+        <w:t xml:space="preserve">Relais-Lora : file d'attente des commandes de configuration (§ 2.5), </w:t>
+      </w:r>
+      <w:r>
+        <w:rPr>
+          <w:rFonts w:ascii="Consolas" w:hAnsi="Consolas" w:eastAsia="Consolas"/>
+          <w:sz w:val="18"/>
+        </w:rPr>
+        <w:t>home/confthnomade/command</w:t>
+      </w:r>
+      <w:r>
+        <w:t xml:space="preserve"> écouté, STATUS avec l'état de la file, publication ABANDON, heure d'été / hiver automatique.</w:t>
+      </w:r>
+    </w:p>
+    <w:p>
+      <w:pPr>
+        <w:pStyle w:val="Listepuces"/>
+      </w:pPr>
+      <w:r>
+        <w:t xml:space="preserve">Capteur : commandes </w:t>
+      </w:r>
+      <w:r>
+        <w:rPr>
+          <w:rFonts w:ascii="Consolas" w:hAnsi="Consolas" w:eastAsia="Consolas"/>
+          <w:sz w:val="18"/>
+        </w:rPr>
+        <w:t>GET</w:t>
+      </w:r>
+      <w:r>
+        <w:t xml:space="preserve"> et </w:t>
+      </w:r>
+      <w:r>
+        <w:rPr>
+          <w:rFonts w:ascii="Consolas" w:hAnsi="Consolas" w:eastAsia="Consolas"/>
+          <w:sz w:val="18"/>
+        </w:rPr>
+        <w:t>SET</w:t>
+      </w:r>
+      <w:r>
+        <w:t xml:space="preserve"> (réponse </w:t>
+      </w:r>
+      <w:r>
+        <w:rPr>
+          <w:rFonts w:ascii="Consolas" w:hAnsi="Consolas" w:eastAsia="Consolas"/>
+          <w:sz w:val="18"/>
+        </w:rPr>
+        <w:t>CONFIG</w:t>
+      </w:r>
+      <w:r>
+        <w:t xml:space="preserve">), </w:t>
+      </w:r>
+      <w:r>
+        <w:rPr>
+          <w:rFonts w:ascii="Consolas" w:hAnsi="Consolas" w:eastAsia="Consolas"/>
+          <w:sz w:val="18"/>
+        </w:rPr>
+        <w:t>SLEEPS</w:t>
+      </w:r>
+      <w:r>
+        <w:t xml:space="preserve"> / </w:t>
+      </w:r>
+      <w:r>
+        <w:rPr>
+          <w:rFonts w:ascii="Consolas" w:hAnsi="Consolas" w:eastAsia="Consolas"/>
+          <w:sz w:val="18"/>
+        </w:rPr>
+        <w:t>SLEEPM</w:t>
+      </w:r>
+      <w:r>
+        <w:t xml:space="preserve"> / </w:t>
+      </w:r>
+      <w:r>
+        <w:rPr>
+          <w:rFonts w:ascii="Consolas" w:hAnsi="Consolas" w:eastAsia="Consolas"/>
+          <w:sz w:val="18"/>
+        </w:rPr>
+        <w:t>SLEEPL</w:t>
+      </w:r>
+      <w:r>
+        <w:t xml:space="preserve"> sans préfixe, </w:t>
+      </w:r>
+      <w:r>
+        <w:rPr>
+          <w:rFonts w:ascii="Consolas" w:hAnsi="Consolas" w:eastAsia="Consolas"/>
+          <w:sz w:val="18"/>
+        </w:rPr>
+        <w:t>&lt;nomBatterie&gt; MESURE</w:t>
+      </w:r>
+      <w:r>
+        <w:t xml:space="preserve">, accusé </w:t>
+      </w:r>
+      <w:r>
+        <w:rPr>
+          <w:rFonts w:ascii="Consolas" w:hAnsi="Consolas" w:eastAsia="Consolas"/>
+          <w:sz w:val="18"/>
+        </w:rPr>
+        <w:t>COMMANDE reçue</w:t>
+      </w:r>
+      <w:r>
+        <w:t xml:space="preserve"> aussi en LoRa, STATUS LoRa sur une ligne, jetons </w:t>
+      </w:r>
+      <w:r>
+        <w:rPr>
+          <w:rFonts w:ascii="Consolas" w:hAnsi="Consolas" w:eastAsia="Consolas"/>
+          <w:sz w:val="18"/>
+        </w:rPr>
+        <w:t>DATE TIME</w:t>
+      </w:r>
+      <w:r>
+        <w:t xml:space="preserve"> sans heure NTP, une seule série de mesures par réveil.</w:t>
+      </w:r>
+    </w:p>
+    <w:p>
+      <w:r>
+        <w:rPr>
+          <w:b/>
+        </w:rPr>
+        <w:t>Version du 26/10/2026</w:t>
+      </w:r>
+      <w:r>
+        <w:t xml:space="preserve"> :</w:t>
       </w:r>
     </w:p>
     <w:p>
@@ -8483,21 +9365,392 @@
       </w:r>
     </w:p>
     <w:p>
+      <w:r>
+        <w:t xml:space="preserve">Les sept anomalies relevées le 26/10/2026 sont </w:t>
+      </w:r>
+      <w:r>
+        <w:rPr>
+          <w:b/>
+        </w:rPr>
+        <w:t>corrigées et testées</w:t>
+      </w:r>
+      <w:r>
+        <w:t xml:space="preserve"> (27/10/2026) :</w:t>
+      </w:r>
+    </w:p>
+    <w:tbl>
+      <w:tblPr>
+        <w:tblStyle w:val="Grilledutableau"/>
+        <w:tblW w:type="auto" w:w="0"/>
+        <w:tblLook w:firstColumn="1" w:firstRow="1" w:lastColumn="0" w:lastRow="0" w:noHBand="0" w:noVBand="1" w:val="04A0"/>
+      </w:tblPr>
+      <w:tblGrid>
+        <w:gridCol w:w="4320"/>
+        <w:gridCol w:w="4320"/>
+      </w:tblGrid>
+      <w:tr>
+        <w:tc>
+          <w:tcPr>
+            <w:tcW w:type="dxa" w:w="4320"/>
+            <w:shd w:val="clear" w:color="auto" w:fill="D9E2F3"/>
+          </w:tcPr>
+          <w:p>
+            <w:r/>
+            <w:r>
+              <w:rPr>
+                <w:b/>
+                <w:sz w:val="18"/>
+              </w:rPr>
+              <w:t>Anomalie</w:t>
+            </w:r>
+          </w:p>
+        </w:tc>
+        <w:tc>
+          <w:tcPr>
+            <w:tcW w:type="dxa" w:w="4320"/>
+            <w:shd w:val="clear" w:color="auto" w:fill="D9E2F3"/>
+          </w:tcPr>
+          <w:p>
+            <w:r/>
+            <w:r>
+              <w:rPr>
+                <w:b/>
+                <w:sz w:val="18"/>
+              </w:rPr>
+              <w:t>Correction</w:t>
+            </w:r>
+          </w:p>
+        </w:tc>
+      </w:tr>
+      <w:tr>
+        <w:tc>
+          <w:tcPr>
+            <w:tcW w:type="dxa" w:w="4320"/>
+          </w:tcPr>
+          <w:p>
+            <w:r/>
+            <w:r>
+              <w:rPr>
+                <w:sz w:val="18"/>
+              </w:rPr>
+              <w:t xml:space="preserve">Relais-Lora non abonné à </w:t>
+            </w:r>
+            <w:r>
+              <w:rPr>
+                <w:rFonts w:ascii="Consolas" w:hAnsi="Consolas" w:eastAsia="Consolas"/>
+                <w:sz w:val="18"/>
+              </w:rPr>
+              <w:t>home/confthnomade/command</w:t>
+            </w:r>
+          </w:p>
+        </w:tc>
+        <w:tc>
+          <w:tcPr>
+            <w:tcW w:type="dxa" w:w="4320"/>
+          </w:tcPr>
+          <w:p>
+            <w:r/>
+            <w:r>
+              <w:rPr>
+                <w:sz w:val="18"/>
+              </w:rPr>
+              <w:t>Abonnements générés depuis la table de la file d'attente</w:t>
+            </w:r>
+          </w:p>
+        </w:tc>
+      </w:tr>
+      <w:tr>
+        <w:tc>
+          <w:tcPr>
+            <w:tcW w:type="dxa" w:w="4320"/>
+          </w:tcPr>
+          <w:p>
+            <w:r/>
+            <w:r>
+              <w:rPr>
+                <w:sz w:val="18"/>
+              </w:rPr>
+              <w:t>Relais-Lora sans file d'attente : commande perdue si le capteur dort</w:t>
+            </w:r>
+          </w:p>
+        </w:tc>
+        <w:tc>
+          <w:tcPr>
+            <w:tcW w:type="dxa" w:w="4320"/>
+          </w:tcPr>
+          <w:p>
+            <w:r/>
+            <w:r>
+              <w:rPr>
+                <w:sz w:val="18"/>
+              </w:rPr>
+              <w:t>File d'attente avec accusé et abandon (§ 2.5)</w:t>
+            </w:r>
+          </w:p>
+        </w:tc>
+      </w:tr>
+      <w:tr>
+        <w:tc>
+          <w:tcPr>
+            <w:tcW w:type="dxa" w:w="4320"/>
+          </w:tcPr>
+          <w:p>
+            <w:r/>
+            <w:r>
+              <w:rPr>
+                <w:sz w:val="18"/>
+              </w:rPr>
+              <w:t xml:space="preserve">Capteur : </w:t>
+            </w:r>
+            <w:r>
+              <w:rPr>
+                <w:rFonts w:ascii="Consolas" w:hAnsi="Consolas" w:eastAsia="Consolas"/>
+                <w:sz w:val="18"/>
+              </w:rPr>
+              <w:t>sendPacket()</w:t>
+            </w:r>
+            <w:r>
+              <w:rPr>
+                <w:sz w:val="18"/>
+              </w:rPr>
+              <w:t xml:space="preserve"> effaçait une réception non traitée</w:t>
+            </w:r>
+          </w:p>
+        </w:tc>
+        <w:tc>
+          <w:tcPr>
+            <w:tcW w:type="dxa" w:w="4320"/>
+          </w:tcPr>
+          <w:p>
+            <w:r/>
+            <w:r>
+              <w:rPr>
+                <w:sz w:val="18"/>
+              </w:rPr>
+              <w:t>Paquet reçu mis de côté avant l'émission, traité ensuite</w:t>
+            </w:r>
+          </w:p>
+        </w:tc>
+      </w:tr>
+      <w:tr>
+        <w:tc>
+          <w:tcPr>
+            <w:tcW w:type="dxa" w:w="4320"/>
+          </w:tcPr>
+          <w:p>
+            <w:r/>
+            <w:r>
+              <w:rPr>
+                <w:sz w:val="18"/>
+              </w:rPr>
+              <w:t xml:space="preserve">Capteur LoRa sans heure : </w:t>
+            </w:r>
+            <w:r>
+              <w:rPr>
+                <w:rFonts w:ascii="Consolas" w:hAnsi="Consolas" w:eastAsia="Consolas"/>
+                <w:sz w:val="18"/>
+              </w:rPr>
+              <w:t>Erreur Erreur</w:t>
+            </w:r>
+            <w:r>
+              <w:rPr>
+                <w:sz w:val="18"/>
+              </w:rPr>
+              <w:t xml:space="preserve">, DEEPSLEEP ON avec </w:t>
+            </w:r>
+            <w:r>
+              <w:rPr>
+                <w:rFonts w:ascii="Consolas" w:hAnsi="Consolas" w:eastAsia="Consolas"/>
+                <w:sz w:val="18"/>
+              </w:rPr>
+              <w:t>DATE HEURE</w:t>
+            </w:r>
+          </w:p>
+        </w:tc>
+        <w:tc>
+          <w:tcPr>
+            <w:tcW w:type="dxa" w:w="4320"/>
+          </w:tcPr>
+          <w:p>
+            <w:r/>
+            <w:r>
+              <w:rPr>
+                <w:sz w:val="18"/>
+              </w:rPr>
+              <w:t xml:space="preserve">Jetons </w:t>
+            </w:r>
+            <w:r>
+              <w:rPr>
+                <w:rFonts w:ascii="Consolas" w:hAnsi="Consolas" w:eastAsia="Consolas"/>
+                <w:sz w:val="18"/>
+              </w:rPr>
+              <w:t>DATE TIME</w:t>
+            </w:r>
+            <w:r>
+              <w:rPr>
+                <w:sz w:val="18"/>
+              </w:rPr>
+              <w:t xml:space="preserve"> partout ; heure valide seulement après NTP</w:t>
+            </w:r>
+          </w:p>
+        </w:tc>
+      </w:tr>
+      <w:tr>
+        <w:tc>
+          <w:tcPr>
+            <w:tcW w:type="dxa" w:w="4320"/>
+          </w:tcPr>
+          <w:p>
+            <w:r/>
+            <w:r>
+              <w:rPr>
+                <w:rFonts w:ascii="Consolas" w:hAnsi="Consolas" w:eastAsia="Consolas"/>
+                <w:sz w:val="18"/>
+              </w:rPr>
+              <w:t>BATxxx MESURE</w:t>
+            </w:r>
+            <w:r>
+              <w:rPr>
+                <w:sz w:val="18"/>
+              </w:rPr>
+              <w:t xml:space="preserve"> jamais traitée</w:t>
+            </w:r>
+          </w:p>
+        </w:tc>
+        <w:tc>
+          <w:tcPr>
+            <w:tcW w:type="dxa" w:w="4320"/>
+          </w:tcPr>
+          <w:p>
+            <w:r/>
+            <w:r>
+              <w:rPr>
+                <w:sz w:val="18"/>
+              </w:rPr>
+              <w:t>Aiguillage batterie en MQTT et LoRa, et topic de commande de la batterie écouté</w:t>
+            </w:r>
+          </w:p>
+        </w:tc>
+      </w:tr>
+      <w:tr>
+        <w:tc>
+          <w:tcPr>
+            <w:tcW w:type="dxa" w:w="4320"/>
+          </w:tcPr>
+          <w:p>
+            <w:r/>
+            <w:r>
+              <w:rPr>
+                <w:rFonts w:ascii="Consolas" w:hAnsi="Consolas" w:eastAsia="Consolas"/>
+                <w:sz w:val="18"/>
+              </w:rPr>
+              <w:t>CConfig::handleMqttCommand()</w:t>
+            </w:r>
+            <w:r>
+              <w:rPr>
+                <w:sz w:val="18"/>
+              </w:rPr>
+              <w:t xml:space="preserve"> du relais vide</w:t>
+            </w:r>
+          </w:p>
+        </w:tc>
+        <w:tc>
+          <w:tcPr>
+            <w:tcW w:type="dxa" w:w="4320"/>
+          </w:tcPr>
+          <w:p>
+            <w:r/>
+            <w:r>
+              <w:rPr>
+                <w:sz w:val="18"/>
+              </w:rPr>
+              <w:t>Sans objet : STATUS et REBOOT traités dans le callback ; STATUS enrichi de l'état de la file</w:t>
+            </w:r>
+          </w:p>
+        </w:tc>
+      </w:tr>
+      <w:tr>
+        <w:tc>
+          <w:tcPr>
+            <w:tcW w:type="dxa" w:w="4320"/>
+          </w:tcPr>
+          <w:p>
+            <w:r/>
+            <w:r>
+              <w:rPr>
+                <w:rFonts w:ascii="Consolas" w:hAnsi="Consolas" w:eastAsia="Consolas"/>
+                <w:sz w:val="18"/>
+              </w:rPr>
+              <w:t>SLEEPS</w:t>
+            </w:r>
+            <w:r>
+              <w:rPr>
+                <w:sz w:val="18"/>
+              </w:rPr>
+              <w:t xml:space="preserve"> seul refusé</w:t>
+            </w:r>
+          </w:p>
+        </w:tc>
+        <w:tc>
+          <w:tcPr>
+            <w:tcW w:type="dxa" w:w="4320"/>
+          </w:tcPr>
+          <w:p>
+            <w:r/>
+            <w:r>
+              <w:rPr>
+                <w:rFonts w:ascii="Consolas" w:hAnsi="Consolas" w:eastAsia="Consolas"/>
+                <w:sz w:val="18"/>
+              </w:rPr>
+              <w:t>SLEEPS</w:t>
+            </w:r>
+            <w:r>
+              <w:rPr>
+                <w:sz w:val="18"/>
+              </w:rPr>
+              <w:t xml:space="preserve"> / </w:t>
+            </w:r>
+            <w:r>
+              <w:rPr>
+                <w:rFonts w:ascii="Consolas" w:hAnsi="Consolas" w:eastAsia="Consolas"/>
+                <w:sz w:val="18"/>
+              </w:rPr>
+              <w:t>SLEEPM</w:t>
+            </w:r>
+            <w:r>
+              <w:rPr>
+                <w:sz w:val="18"/>
+              </w:rPr>
+              <w:t xml:space="preserve"> / </w:t>
+            </w:r>
+            <w:r>
+              <w:rPr>
+                <w:rFonts w:ascii="Consolas" w:hAnsi="Consolas" w:eastAsia="Consolas"/>
+                <w:sz w:val="18"/>
+              </w:rPr>
+              <w:t>SLEEPL</w:t>
+            </w:r>
+            <w:r>
+              <w:rPr>
+                <w:sz w:val="18"/>
+              </w:rPr>
+              <w:t xml:space="preserve"> acceptés sans préfixe</w:t>
+            </w:r>
+          </w:p>
+        </w:tc>
+      </w:tr>
+    </w:tbl>
+    <w:p>
+      <w:pPr>
+        <w:spacing w:after="0"/>
+      </w:pPr>
+    </w:p>
+    <w:p>
       <w:pPr>
         <w:pStyle w:val="Listepuces"/>
       </w:pPr>
       <w:r>
-        <w:t xml:space="preserve">Relais-Lora : pas d'abonnement à </w:t>
-      </w:r>
-      <w:r>
-        <w:rPr>
-          <w:rFonts w:ascii="Consolas" w:hAnsi="Consolas" w:eastAsia="Consolas"/>
-          <w:sz w:val="18"/>
-        </w:rPr>
-        <w:t>home/confthnomade/command</w:t>
-      </w:r>
-      <w:r>
-        <w:t xml:space="preserve"> ; les SLEEP envoyés à ThNomade par HA ne sont pas relayés en LoRa.</w:t>
+        <w:t>Corrigé aussi : le STATUS LoRa du capteur (multiligne avec « === ») était rejeté par le relais ; l'heure du relais avançait d'une heure en hiver (décalages fixes).</w:t>
       </w:r>
     </w:p>
     <w:p>
@@ -8505,81 +9758,7 @@
         <w:pStyle w:val="Listepuces"/>
       </w:pPr>
       <w:r>
-        <w:t>Relais-Lora : aucune file d'attente ; une commande arrivant pendant le sommeil du capteur LoRa est perdue (voir encadré).</w:t>
-      </w:r>
-    </w:p>
-    <w:p>
-      <w:pPr>
-        <w:pStyle w:val="Listepuces"/>
-      </w:pPr>
-      <w:r>
-        <w:t xml:space="preserve">Capteur LoRa : </w:t>
-      </w:r>
-      <w:r>
-        <w:rPr>
-          <w:rFonts w:ascii="Consolas" w:hAnsi="Consolas" w:eastAsia="Consolas"/>
-          <w:sz w:val="18"/>
-        </w:rPr>
-        <w:t>sendPacket()</w:t>
-      </w:r>
-      <w:r>
-        <w:t xml:space="preserve"> remet </w:t>
-      </w:r>
-      <w:r>
-        <w:rPr>
-          <w:rFonts w:ascii="Consolas" w:hAnsi="Consolas" w:eastAsia="Consolas"/>
-          <w:sz w:val="18"/>
-        </w:rPr>
-        <w:t>operationDone</w:t>
-      </w:r>
-      <w:r>
-        <w:t xml:space="preserve"> à false avant d'émettre, ce qui peut effacer une réception pas encore traitée.</w:t>
-      </w:r>
-    </w:p>
-    <w:p>
-      <w:pPr>
-        <w:pStyle w:val="Listepuces"/>
-      </w:pPr>
-      <w:r>
-        <w:t xml:space="preserve">Capteur LoRa sans heure : les mesures partent avec </w:t>
-      </w:r>
-      <w:r>
-        <w:rPr>
-          <w:rFonts w:ascii="Consolas" w:hAnsi="Consolas" w:eastAsia="Consolas"/>
-          <w:sz w:val="18"/>
-        </w:rPr>
-        <w:t>Erreur Erreur</w:t>
-      </w:r>
-      <w:r>
-        <w:t xml:space="preserve"> au lieu des jetons </w:t>
-      </w:r>
-      <w:r>
-        <w:rPr>
-          <w:rFonts w:ascii="Consolas" w:hAnsi="Consolas" w:eastAsia="Consolas"/>
-          <w:sz w:val="18"/>
-        </w:rPr>
-        <w:t>DATE TIME</w:t>
-      </w:r>
-      <w:r>
-        <w:t xml:space="preserve">, et DEEPSLEEP ON avec </w:t>
-      </w:r>
-      <w:r>
-        <w:rPr>
-          <w:rFonts w:ascii="Consolas" w:hAnsi="Consolas" w:eastAsia="Consolas"/>
-          <w:sz w:val="18"/>
-        </w:rPr>
-        <w:t>DATE HEURE</w:t>
-      </w:r>
-      <w:r>
-        <w:t xml:space="preserve"> ; le relais ne substitue que DATE et TIME.</w:t>
-      </w:r>
-    </w:p>
-    <w:p>
-      <w:pPr>
-        <w:pStyle w:val="Listepuces"/>
-      </w:pPr>
-      <w:r>
-        <w:t xml:space="preserve">Batterie : aucune commande MESURE n'est traitée côté capteur (pas d'aiguillage BATxxx sur </w:t>
+        <w:t xml:space="preserve">Choix assumé : </w:t>
       </w:r>
       <w:r>
         <w:rPr>
@@ -8589,15 +9768,7 @@
         <w:t>home/thermometre/command</w:t>
       </w:r>
       <w:r>
-        <w:t>), alors que le CYD en envoie.</w:t>
-      </w:r>
-    </w:p>
-    <w:p>
-      <w:pPr>
-        <w:pStyle w:val="Listepuces"/>
-      </w:pPr>
-      <w:r>
-        <w:t>CConfig::handleMqttCommand() du Relais-Lora est vide : seuls STATUS et REBOOT agissent.</w:t>
+        <w:t xml:space="preserve"> (MESURE, ACK) ne passe pas par la file d'attente.</w:t>
       </w:r>
     </w:p>
     <w:sectPr>

</xml_diff>

<commit_message>
STATUS sur une ligne et journal web (Capteur 2.1, Relais 1.3, CYD 3.2)
- Capteur : CConfig::getStatusLigne() remplace getWatchdogStatus (réponse
  STATUS sur une ligne, MQTT et LoRa).
- Journal web /logs commun (MyJournal identique dans les trois projets) :
  heure réelle si connue, sinon uptime ; filtre, masquer, pause, vider.
- Relais-Lora : page Journal ; CYD : cases DBG en direct, home/log conservé.
- HA : commentaires mis à jour ; Doc/mqtt.docx : STATUS et entrée du 29/10.

Co-Authored-By: Claude Opus 5.5 <noreply@anthropic.com>
</commit_message>
<xml_diff>
--- a/Doc/mqtt.docx
+++ b/Doc/mqtt.docx
@@ -2749,33 +2749,31 @@
               <w:rPr>
                 <w:sz w:val="18"/>
               </w:rPr>
-              <w:t xml:space="preserve">Rapport multiligne </w:t>
-            </w:r>
-            <w:r>
-              <w:rPr>
-                <w:rFonts w:ascii="Consolas" w:hAnsi="Consolas" w:eastAsia="Consolas"/>
-                <w:sz w:val="18"/>
-              </w:rPr>
-              <w:t>=== ÉTAT &lt;nom&gt; ===</w:t>
-            </w:r>
-            <w:r>
-              <w:rPr>
-                <w:sz w:val="18"/>
-              </w:rPr>
-              <w:t xml:space="preserve"> (date, IP, Wdog, Uptime) ; en LoRa : une ligne </w:t>
-            </w:r>
-            <w:r>
-              <w:rPr>
-                <w:rFonts w:ascii="Consolas" w:hAnsi="Consolas" w:eastAsia="Consolas"/>
-                <w:sz w:val="18"/>
-              </w:rPr>
-              <w:t>&lt;nom&gt; ETAT …</w:t>
+              <w:t xml:space="preserve">Une ligne, en Wi-Fi comme en LoRa : </w:t>
+            </w:r>
+            <w:r>
+              <w:rPr>
+                <w:rFonts w:ascii="Consolas" w:hAnsi="Consolas" w:eastAsia="Consolas"/>
+                <w:sz w:val="18"/>
+              </w:rPr>
+              <w:t>&lt;nom&gt; ETAT &lt;date&gt; &lt;heure&gt; | IP : &lt;ip&gt; | Wdog : … | Uptime : &lt;s&gt;s</w:t>
             </w:r>
             <w:r>
               <w:rPr>
                 <w:sz w:val="18"/>
               </w:rPr>
               <w:t xml:space="preserve"> (§ 2.3)</w:t>
+            </w:r>
+            <w:r>
+              <w:rPr>
+                <w:rFonts w:ascii="Consolas" w:hAnsi="Consolas" w:eastAsia="Consolas"/>
+                <w:sz w:val="18"/>
+              </w:rPr>
+            </w:r>
+            <w:r>
+              <w:rPr>
+                <w:sz w:val="18"/>
+              </w:rPr>
             </w:r>
           </w:p>
         </w:tc>
@@ -9693,6 +9691,22 @@
       </w:pPr>
       <w:r>
         <w:t>8. Ce qui a changé par rapport à la version précédente du document</w:t>
+      </w:r>
+    </w:p>
+    <w:p>
+      <w:r>
+        <w:rPr>
+          <w:b/>
+        </w:rPr>
+        <w:t>Version du 29/10/2026 :</w:t>
+      </w:r>
+    </w:p>
+    <w:p>
+      <w:pPr>
+        <w:pStyle w:val="Listepuces"/>
+      </w:pPr>
+      <w:r>
+        <w:t>Capteur : la réponse à STATUS tient sur une ligne en Wi-Fi aussi (même format qu'en LoRa, CConfig::getStatusLigne) ; l'ancien rapport multiligne « === ÉTAT &lt;nom&gt; === » est abandonné.</w:t>
       </w:r>
     </w:p>
     <w:p>

</xml_diff>